<commit_message>
updated the numbering. exported a pdf of standup 1 report.
</commit_message>
<xml_diff>
--- a/Assignment 3A_Project Standups/Assignment 3A - Project standup 1.docx
+++ b/Assignment 3A_Project Standups/Assignment 3A - Project standup 1.docx
@@ -1895,6 +1895,10 @@
     <w:p>
       <w:pPr>
         <w:pStyle w:val="Heading5"/>
+        <w:numPr>
+          <w:ilvl w:val="0"/>
+          <w:numId w:val="45"/>
+        </w:numPr>
         <w:rPr>
           <w:b w:val="0"/>
           <w:bCs w:val="0"/>
@@ -8718,6 +8722,36 @@
     <w:abstractNumId w:val="4"/>
   </w:num>
   <w:num w:numId="44" w16cid:durableId="686759784">
+    <w:abstractNumId w:val="4"/>
+    <w:lvlOverride w:ilvl="0">
+      <w:startOverride w:val="1"/>
+    </w:lvlOverride>
+    <w:lvlOverride w:ilvl="1">
+      <w:startOverride w:val="1"/>
+    </w:lvlOverride>
+    <w:lvlOverride w:ilvl="2">
+      <w:startOverride w:val="1"/>
+    </w:lvlOverride>
+    <w:lvlOverride w:ilvl="3">
+      <w:startOverride w:val="1"/>
+    </w:lvlOverride>
+    <w:lvlOverride w:ilvl="4">
+      <w:startOverride w:val="1"/>
+    </w:lvlOverride>
+    <w:lvlOverride w:ilvl="5">
+      <w:startOverride w:val="1"/>
+    </w:lvlOverride>
+    <w:lvlOverride w:ilvl="6">
+      <w:startOverride w:val="1"/>
+    </w:lvlOverride>
+    <w:lvlOverride w:ilvl="7">
+      <w:startOverride w:val="1"/>
+    </w:lvlOverride>
+    <w:lvlOverride w:ilvl="8">
+      <w:startOverride w:val="1"/>
+    </w:lvlOverride>
+  </w:num>
+  <w:num w:numId="45" w16cid:durableId="1288319225">
     <w:abstractNumId w:val="4"/>
     <w:lvlOverride w:ilvl="0">
       <w:startOverride w:val="1"/>

</xml_diff>